<commit_message>
docs: correct sandbox dataset claim after measuring it
The explainer stated the sandbox data was small and static. Measured against
the live API it holds 7,690 Business Partner records: 59% organisations, 41%
people, eight grouping codes, creation dates spread across 2016-2026.

The real constraint is different from the one documented. Row count is not the
limit -- the absence of transactional data on this entity is. Aggregate
questions about revenue need a second API rather than more rows, which matters
when choosing which demo questions to build toward.
</commit_message>
<xml_diff>
--- a/docs/SAPTalk-Explained.docx
+++ b/docs/SAPTalk-Explained.docx
@@ -1891,7 +1891,21 @@
     </w:p>
     <w:p>
       <w:r>
-        <w:t>The sandbox data is small and static. It is enough to prove the concept, but nobody has generated years of sales history in it — so we scope our demo questions to what actually exists.</w:t>
+        <w:t xml:space="preserve">The sandbox data turns out to be substantial. Measured on 29 August 2026: </w:t>
+      </w:r>
+      <w:r>
+        <w:rPr>
+          <w:b/>
+        </w:rPr>
+        <w:t>7,690 Business Partner records</w:t>
+      </w:r>
+      <w:r>
+        <w:t xml:space="preserve"> — 59% organisations and 41% people, eight different grouping codes, and creation dates spread evenly across 2016 to 2026. Filtering, name search, date ranges and sorting all have real data behind them.</w:t>
+      </w:r>
+    </w:p>
+    <w:p>
+      <w:r>
+        <w:t>What it does not contain is transactional history. This entity holds no orders and no revenue figures, so a question like “top customers by revenue last quarter” cannot be answered no matter how many rows there are. Answering that would mean adding a second API, not finding more data in this one.</w:t>
       </w:r>
     </w:p>
     <w:p>

</xml_diff>